<commit_message>
Fix the dock end cards being clipped; ship 2.1.7 (65)
- dockBand left clipToPadding at its ViewGroup default, so dispatchDraw
  clipped the 1.10x focused end tiles to the 14dp padding box and a dark
  strip showed between the card and the glass rim. Middle slots never
  showed it because their overflow stays inside the padding box.
- The programme dots now ride along with the dock in onScrolled instead
  of being placed from pre-scroll coordinates.
- make-tutorial-docx.py renders the markdown instead of a hand-copied
  body; the two had drifted (md 2.1.4, docx 2.0.15). Tutorial updated
  for 2.1.7.
</commit_message>
<xml_diff>
--- a/docs/安装与恢复教程.docx
+++ b/docs/安装与恢复教程.docx
@@ -13,7 +13,7 @@
           <w:color w:val="23201C"/>
           <w:sz w:val="40"/>
         </w:rPr>
-        <w:t>电视桌面 2.0.15 安装教程</w:t>
+        <w:t>电视桌面 2.1.7 安装教程</w:t>
       </w:r>
     </w:p>
     <w:p>
@@ -24,17 +24,44 @@
         <w:rPr>
           <w:rFonts w:ascii="Calibri" w:hAnsi="Calibri" w:eastAsia="微软雅黑"/>
           <w:b w:val="0"/>
-          <w:color w:val="55504B"/>
-          <w:sz w:val="21"/>
+          <w:color w:val="23201C"/>
+          <w:sz w:val="22"/>
         </w:rPr>
-        <w:t>适用于小米、创维等品牌的安卓电视（Android 6.0 及以上）。装它不改系统、不删原厂应用，原厂桌面还在，只是被盖住；不想用了随时恢复。安卓 4.0–5.1 的老电视装「老设备版」，见第七节。</w:t>
+        <w:t>适用于小米、创维等品牌的安卓电视（Android 6.0 及以上）。装它不改系统、不删原厂应用，原厂桌面还在，只是被盖住；不想用了随时恢复。</w:t>
+      </w:r>
+    </w:p>
+    <w:p>
+      <w:pPr>
+        <w:spacing w:before="0" w:after="120"/>
+      </w:pPr>
+      <w:r>
+        <w:rPr>
+          <w:rFonts w:ascii="Calibri" w:hAnsi="Calibri" w:eastAsia="微软雅黑"/>
+          <w:b w:val="0"/>
+          <w:color w:val="23201C"/>
+          <w:sz w:val="22"/>
+        </w:rPr>
+        <w:t>安卓 4.0–5.1 的老电视装「老设备版」，见第七节。</w:t>
+      </w:r>
+    </w:p>
+    <w:p>
+      <w:pPr>
+        <w:spacing w:before="0" w:after="120"/>
+      </w:pPr>
+      <w:r>
+        <w:rPr>
+          <w:rFonts w:ascii="Calibri" w:hAnsi="Calibri" w:eastAsia="微软雅黑"/>
+          <w:b/>
+          <w:color w:val="23201C"/>
+          <w:sz w:val="22"/>
+        </w:rPr>
+        <w:t>发群里的简版：</w:t>
       </w:r>
     </w:p>
     <w:tbl>
       <w:tblPr>
         <w:tblW w:type="auto" w:w="0"/>
         <w:jc w:val="center"/>
-        <w:tblLayout w:type="autofit"/>
         <w:tblLook w:firstColumn="1" w:firstRow="1" w:lastColumn="0" w:lastRow="0" w:noHBand="0" w:noVBand="1" w:val="04A0"/>
       </w:tblPr>
       <w:tblGrid>
@@ -46,21 +73,6 @@
             <w:tcW w:type="dxa" w:w="9184"/>
             <w:shd w:val="clear" w:fill="FDF3EE"/>
           </w:tcPr>
-          <w:p>
-            <w:pPr>
-              <w:spacing w:after="40"/>
-            </w:pPr>
-            <w:r/>
-            <w:r>
-              <w:rPr>
-                <w:rFonts w:ascii="Calibri" w:hAnsi="Calibri" w:eastAsia="微软雅黑"/>
-                <w:b/>
-                <w:color w:val="23201C"/>
-                <w:sz w:val="21"/>
-              </w:rPr>
-              <w:t>发群里的简版</w:t>
-            </w:r>
-          </w:p>
           <w:p>
             <w:pPr>
               <w:spacing w:after="40"/>
@@ -100,7 +112,21 @@
                 <w:color w:val="23201C"/>
                 <w:sz w:val="21"/>
               </w:rPr>
-              <w:t>想恢复：设置里关掉这两个权限，再卸载。详细步骤和恢复脚本在这份文档里。</w:t>
+              <w:t>想恢复：设置里关掉这两个权限，再卸载。</w:t>
+            </w:r>
+          </w:p>
+          <w:p>
+            <w:pPr>
+              <w:spacing w:after="40"/>
+            </w:pPr>
+            <w:r>
+              <w:rPr>
+                <w:rFonts w:ascii="Calibri" w:hAnsi="Calibri" w:eastAsia="微软雅黑"/>
+                <w:b w:val="0"/>
+                <w:color w:val="23201C"/>
+                <w:sz w:val="21"/>
+              </w:rPr>
+              <w:t>详细步骤和恢复脚本在这份文档里。</w:t>
             </w:r>
           </w:p>
         </w:tc>
@@ -137,7 +163,58 @@
           <w:color w:val="23201C"/>
           <w:sz w:val="22"/>
         </w:rPr>
-        <w:t>U 盘一个，FAT32 格式，把 tvhome-zh-2.0.15.apk 拷到根目录。老电视用 tvhome-zh-2.0.15-legacy.apk。</w:t>
+        <w:t xml:space="preserve">U 盘一个，FAT32 格式，把 </w:t>
+      </w:r>
+      <w:r>
+        <w:rPr>
+          <w:rFonts w:ascii="Consolas" w:hAnsi="Consolas" w:eastAsia="Consolas"/>
+          <w:b w:val="0"/>
+          <w:color w:val="23201C"/>
+          <w:sz w:val="22"/>
+        </w:rPr>
+        <w:t>tvhome-zh-2.1.7.apk</w:t>
+      </w:r>
+      <w:r>
+        <w:rPr>
+          <w:rFonts w:ascii="Calibri" w:hAnsi="Calibri" w:eastAsia="微软雅黑"/>
+          <w:b w:val="0"/>
+          <w:color w:val="23201C"/>
+          <w:sz w:val="22"/>
+        </w:rPr>
+        <w:t xml:space="preserve"> 拷到根目录。老电视用 </w:t>
+      </w:r>
+      <w:r>
+        <w:rPr>
+          <w:rFonts w:ascii="Consolas" w:hAnsi="Consolas" w:eastAsia="Consolas"/>
+          <w:b w:val="0"/>
+          <w:color w:val="23201C"/>
+          <w:sz w:val="22"/>
+        </w:rPr>
+        <w:t>tvhome-zh-2.1.7-legacy.apk</w:t>
+      </w:r>
+      <w:r>
+        <w:rPr>
+          <w:rFonts w:ascii="Calibri" w:hAnsi="Calibri" w:eastAsia="微软雅黑"/>
+          <w:b w:val="0"/>
+          <w:color w:val="23201C"/>
+          <w:sz w:val="22"/>
+        </w:rPr>
+        <w:t>。</w:t>
+      </w:r>
+    </w:p>
+    <w:p>
+      <w:pPr>
+        <w:pStyle w:val="ListBullet"/>
+        <w:spacing w:after="80"/>
+      </w:pPr>
+      <w:r>
+        <w:rPr>
+          <w:rFonts w:ascii="Calibri" w:hAnsi="Calibri" w:eastAsia="微软雅黑"/>
+          <w:b w:val="0"/>
+          <w:color w:val="23201C"/>
+          <w:sz w:val="22"/>
+        </w:rPr>
+        <w:t>小米 HyperOS 3 机型（例如 MiTV-MFFU0）必须用 idun 定制版，标准版装上去按 Home 还是会回原厂桌面。</w:t>
       </w:r>
     </w:p>
     <w:p>
@@ -163,11 +240,20 @@
       <w:r>
         <w:rPr>
           <w:rFonts w:ascii="Calibri" w:hAnsi="Calibri" w:eastAsia="微软雅黑"/>
+          <w:b/>
+          <w:color w:val="23201C"/>
+          <w:sz w:val="22"/>
+        </w:rPr>
+        <w:t>手机不能装</w:t>
+      </w:r>
+      <w:r>
+        <w:rPr>
+          <w:rFonts w:ascii="Calibri" w:hAnsi="Calibri" w:eastAsia="微软雅黑"/>
           <w:b w:val="0"/>
           <w:color w:val="23201C"/>
           <w:sz w:val="22"/>
         </w:rPr>
-        <w:t>手机不能装：2.0.15 起在手机上打开会提示「这是电视桌面」，并可直接卸载。本应用只支持电视、投影仪和电视盒子。</w:t>
+        <w:t>：2.0.15 起在手机上打开会提示「这是电视桌面」，并可直接卸载。本应用只支持电视、投影仪和电视盒子。</w:t>
       </w:r>
     </w:p>
     <w:p>
@@ -186,8 +272,7 @@
     </w:p>
     <w:p>
       <w:pPr>
-        <w:pStyle w:val="ListBullet"/>
-        <w:spacing w:after="80"/>
+        <w:spacing w:before="0" w:after="120"/>
       </w:pPr>
       <w:r>
         <w:rPr>
@@ -196,13 +281,12 @@
           <w:color w:val="23201C"/>
           <w:sz w:val="22"/>
         </w:rPr>
-        <w:t>U 盘插到电视 USB 口。</w:t>
+        <w:t>1. U 盘插到电视 USB 口。</w:t>
       </w:r>
     </w:p>
     <w:p>
       <w:pPr>
-        <w:pStyle w:val="ListBullet"/>
-        <w:spacing w:after="80"/>
+        <w:spacing w:before="0" w:after="120"/>
       </w:pPr>
       <w:r>
         <w:rPr>
@@ -211,13 +295,12 @@
           <w:color w:val="23201C"/>
           <w:sz w:val="22"/>
         </w:rPr>
-        <w:t>电视上打开「应用 → 媒体中心」（有的固件叫「高清播放器」）。</w:t>
+        <w:t>2. 电视上打开「应用 → 媒体中心」（有的固件叫「高清播放器」）。</w:t>
       </w:r>
     </w:p>
     <w:p>
       <w:pPr>
-        <w:pStyle w:val="ListBullet"/>
-        <w:spacing w:after="80"/>
+        <w:spacing w:before="0" w:after="120"/>
       </w:pPr>
       <w:r>
         <w:rPr>
@@ -226,13 +309,12 @@
           <w:color w:val="23201C"/>
           <w:sz w:val="22"/>
         </w:rPr>
-        <w:t>找到 apk，按确定安装。</w:t>
+        <w:t>3. 找到 apk，按确定安装。</w:t>
       </w:r>
     </w:p>
     <w:p>
       <w:pPr>
-        <w:pStyle w:val="ListBullet"/>
-        <w:spacing w:after="80"/>
+        <w:spacing w:before="0" w:after="120"/>
       </w:pPr>
       <w:r>
         <w:rPr>
@@ -241,7 +323,341 @@
           <w:color w:val="23201C"/>
           <w:sz w:val="22"/>
         </w:rPr>
-        <w:t>提示未知来源时：设置 → 账号与安全 → 允许安装未知来源应用。</w:t>
+        <w:t>4. 提示未知来源时：设置 → 账号与安全 → 允许安装未知来源应用。</w:t>
+      </w:r>
+    </w:p>
+    <w:p>
+      <w:pPr>
+        <w:spacing w:before="160" w:after="40"/>
+      </w:pPr>
+      <w:r>
+        <w:rPr>
+          <w:rFonts w:ascii="Calibri" w:hAnsi="Calibri" w:eastAsia="微软雅黑"/>
+          <w:b/>
+          <w:color w:val="23201C"/>
+          <w:sz w:val="22"/>
+        </w:rPr>
+        <w:t>提示「应用未安装」或「已阻止」怎么办</w:t>
+      </w:r>
+    </w:p>
+    <w:p>
+      <w:pPr>
+        <w:spacing w:before="0" w:after="120"/>
+      </w:pPr>
+      <w:r>
+        <w:rPr>
+          <w:rFonts w:ascii="Calibri" w:hAnsi="Calibri" w:eastAsia="微软雅黑"/>
+          <w:b w:val="0"/>
+          <w:color w:val="23201C"/>
+          <w:sz w:val="22"/>
+        </w:rPr>
+        <w:t>按顺序排查，前两条最常见：</w:t>
+      </w:r>
+    </w:p>
+    <w:p>
+      <w:pPr>
+        <w:spacing w:before="0" w:after="120"/>
+      </w:pPr>
+      <w:r>
+        <w:rPr>
+          <w:rFonts w:ascii="Calibri" w:hAnsi="Calibri" w:eastAsia="微软雅黑"/>
+          <w:b w:val="0"/>
+          <w:color w:val="23201C"/>
+          <w:sz w:val="22"/>
+        </w:rPr>
+        <w:t xml:space="preserve">1. </w:t>
+      </w:r>
+      <w:r>
+        <w:rPr>
+          <w:rFonts w:ascii="Calibri" w:hAnsi="Calibri" w:eastAsia="微软雅黑"/>
+          <w:b/>
+          <w:color w:val="23201C"/>
+          <w:sz w:val="22"/>
+        </w:rPr>
+        <w:t>先卸载旧版</w:t>
+      </w:r>
+      <w:r>
+        <w:rPr>
+          <w:rFonts w:ascii="Calibri" w:hAnsi="Calibri" w:eastAsia="微软雅黑"/>
+          <w:b w:val="0"/>
+          <w:color w:val="23201C"/>
+          <w:sz w:val="22"/>
+        </w:rPr>
+        <w:t>。之前装过别人打包的版本（签名不一样），或者装过更高版本（比如 beta），覆盖安装一定失败。到「应用」里把电视桌面卸掉再装。卸载会重置桌面设置（常用应用、壁纸），重装后重新设一下。</w:t>
+      </w:r>
+    </w:p>
+    <w:p>
+      <w:pPr>
+        <w:spacing w:before="0" w:after="120"/>
+      </w:pPr>
+      <w:r>
+        <w:rPr>
+          <w:rFonts w:ascii="Calibri" w:hAnsi="Calibri" w:eastAsia="微软雅黑"/>
+          <w:b w:val="0"/>
+          <w:color w:val="23201C"/>
+          <w:sz w:val="22"/>
+        </w:rPr>
+        <w:t xml:space="preserve">2. </w:t>
+      </w:r>
+      <w:r>
+        <w:rPr>
+          <w:rFonts w:ascii="Calibri" w:hAnsi="Calibri" w:eastAsia="微软雅黑"/>
+          <w:b/>
+          <w:color w:val="23201C"/>
+          <w:sz w:val="22"/>
+        </w:rPr>
+        <w:t>打开「未知来源」</w:t>
+      </w:r>
+      <w:r>
+        <w:rPr>
+          <w:rFonts w:ascii="Calibri" w:hAnsi="Calibri" w:eastAsia="微软雅黑"/>
+          <w:b w:val="0"/>
+          <w:color w:val="23201C"/>
+          <w:sz w:val="22"/>
+        </w:rPr>
+        <w:t>。各品牌位置：</w:t>
+      </w:r>
+    </w:p>
+    <w:p>
+      <w:pPr>
+        <w:pStyle w:val="ListBullet"/>
+        <w:spacing w:after="80"/>
+        <w:ind w:left="340"/>
+      </w:pPr>
+      <w:r>
+        <w:rPr>
+          <w:rFonts w:ascii="Calibri" w:hAnsi="Calibri" w:eastAsia="微软雅黑"/>
+          <w:b w:val="0"/>
+          <w:color w:val="23201C"/>
+          <w:sz w:val="22"/>
+        </w:rPr>
+        <w:t>小米 / Redmi：设置 → 账号与安全 → 允许安装未知来源的应用</w:t>
+      </w:r>
+    </w:p>
+    <w:p>
+      <w:pPr>
+        <w:pStyle w:val="ListBullet"/>
+        <w:spacing w:after="80"/>
+        <w:ind w:left="340"/>
+      </w:pPr>
+      <w:r>
+        <w:rPr>
+          <w:rFonts w:ascii="Calibri" w:hAnsi="Calibri" w:eastAsia="微软雅黑"/>
+          <w:b w:val="0"/>
+          <w:color w:val="23201C"/>
+          <w:sz w:val="22"/>
+        </w:rPr>
+        <w:t>创维 / 酷开：设置 → 通用 → 允许安装未知来源应用；有的型号走「我的应用 → U 盘安装」</w:t>
+      </w:r>
+    </w:p>
+    <w:p>
+      <w:pPr>
+        <w:pStyle w:val="ListBullet"/>
+        <w:spacing w:after="80"/>
+        <w:ind w:left="340"/>
+      </w:pPr>
+      <w:r>
+        <w:rPr>
+          <w:rFonts w:ascii="Calibri" w:hAnsi="Calibri" w:eastAsia="微软雅黑"/>
+          <w:b w:val="0"/>
+          <w:color w:val="23201C"/>
+          <w:sz w:val="22"/>
+        </w:rPr>
+        <w:t>海信：设置 → 更多设置 → 通用 → 商场模式</w:t>
+      </w:r>
+    </w:p>
+    <w:p>
+      <w:pPr>
+        <w:pStyle w:val="ListBullet"/>
+        <w:spacing w:after="80"/>
+        <w:ind w:left="340"/>
+      </w:pPr>
+      <w:r>
+        <w:rPr>
+          <w:rFonts w:ascii="Calibri" w:hAnsi="Calibri" w:eastAsia="微软雅黑"/>
+          <w:b w:val="0"/>
+          <w:color w:val="23201C"/>
+          <w:sz w:val="22"/>
+        </w:rPr>
+        <w:t>TCL：设置 → 系统 → 安全 → 安装未知应用</w:t>
+      </w:r>
+    </w:p>
+    <w:p>
+      <w:pPr>
+        <w:pStyle w:val="ListBullet"/>
+        <w:spacing w:after="80"/>
+        <w:ind w:left="340"/>
+      </w:pPr>
+      <w:r>
+        <w:rPr>
+          <w:rFonts w:ascii="Calibri" w:hAnsi="Calibri" w:eastAsia="微软雅黑"/>
+          <w:b w:val="0"/>
+          <w:color w:val="23201C"/>
+          <w:sz w:val="22"/>
+        </w:rPr>
+        <w:t>华为 / 荣耀：设置 → 安全 → 更多安全设置，关掉「纯净模式」</w:t>
+      </w:r>
+    </w:p>
+    <w:p>
+      <w:pPr>
+        <w:pStyle w:val="ListBullet"/>
+        <w:spacing w:after="80"/>
+        <w:ind w:left="340"/>
+      </w:pPr>
+      <w:r>
+        <w:rPr>
+          <w:rFonts w:ascii="Calibri" w:hAnsi="Calibri" w:eastAsia="微软雅黑"/>
+          <w:b w:val="0"/>
+          <w:color w:val="23201C"/>
+          <w:sz w:val="22"/>
+        </w:rPr>
+        <w:t>索尼：设置 → 安全和限制 → 未知来源</w:t>
+      </w:r>
+    </w:p>
+    <w:p>
+      <w:pPr>
+        <w:spacing w:before="0" w:after="120"/>
+      </w:pPr>
+      <w:r>
+        <w:rPr>
+          <w:rFonts w:ascii="Calibri" w:hAnsi="Calibri" w:eastAsia="微软雅黑"/>
+          <w:b w:val="0"/>
+          <w:color w:val="23201C"/>
+          <w:sz w:val="22"/>
+        </w:rPr>
+        <w:t xml:space="preserve">3. </w:t>
+      </w:r>
+      <w:r>
+        <w:rPr>
+          <w:rFonts w:ascii="Calibri" w:hAnsi="Calibri" w:eastAsia="微软雅黑"/>
+          <w:b/>
+          <w:color w:val="23201C"/>
+          <w:sz w:val="22"/>
+        </w:rPr>
+        <w:t>安全软件拦截</w:t>
+      </w:r>
+      <w:r>
+        <w:rPr>
+          <w:rFonts w:ascii="Calibri" w:hAnsi="Calibri" w:eastAsia="微软雅黑"/>
+          <w:b w:val="0"/>
+          <w:color w:val="23201C"/>
+          <w:sz w:val="22"/>
+        </w:rPr>
+        <w:t>：小米电视管家、各家的安全中心会拦第三方安装，先关掉「安装检测 / 病毒扫描」再装。</w:t>
+      </w:r>
+    </w:p>
+    <w:p>
+      <w:pPr>
+        <w:spacing w:before="0" w:after="120"/>
+      </w:pPr>
+      <w:r>
+        <w:rPr>
+          <w:rFonts w:ascii="Calibri" w:hAnsi="Calibri" w:eastAsia="微软雅黑"/>
+          <w:b w:val="0"/>
+          <w:color w:val="23201C"/>
+          <w:sz w:val="22"/>
+        </w:rPr>
+        <w:t xml:space="preserve">4. </w:t>
+      </w:r>
+      <w:r>
+        <w:rPr>
+          <w:rFonts w:ascii="Calibri" w:hAnsi="Calibri" w:eastAsia="微软雅黑"/>
+          <w:b/>
+          <w:color w:val="23201C"/>
+          <w:sz w:val="22"/>
+        </w:rPr>
+        <w:t>系统版本不对</w:t>
+      </w:r>
+      <w:r>
+        <w:rPr>
+          <w:rFonts w:ascii="Calibri" w:hAnsi="Calibri" w:eastAsia="微软雅黑"/>
+          <w:b w:val="0"/>
+          <w:color w:val="23201C"/>
+          <w:sz w:val="22"/>
+        </w:rPr>
+        <w:t xml:space="preserve">：安卓 5.1 及以下必须装 </w:t>
+      </w:r>
+      <w:r>
+        <w:rPr>
+          <w:rFonts w:ascii="Consolas" w:hAnsi="Consolas" w:eastAsia="Consolas"/>
+          <w:b w:val="0"/>
+          <w:color w:val="23201C"/>
+          <w:sz w:val="22"/>
+        </w:rPr>
+        <w:t>-legacy</w:t>
+      </w:r>
+      <w:r>
+        <w:rPr>
+          <w:rFonts w:ascii="Calibri" w:hAnsi="Calibri" w:eastAsia="微软雅黑"/>
+          <w:b w:val="0"/>
+          <w:color w:val="23201C"/>
+          <w:sz w:val="22"/>
+        </w:rPr>
+        <w:t xml:space="preserve"> 包，装普通版会提示未安装。</w:t>
+      </w:r>
+    </w:p>
+    <w:p>
+      <w:pPr>
+        <w:spacing w:before="0" w:after="120"/>
+      </w:pPr>
+      <w:r>
+        <w:rPr>
+          <w:rFonts w:ascii="Calibri" w:hAnsi="Calibri" w:eastAsia="微软雅黑"/>
+          <w:b w:val="0"/>
+          <w:color w:val="23201C"/>
+          <w:sz w:val="22"/>
+        </w:rPr>
+        <w:t xml:space="preserve">5. </w:t>
+      </w:r>
+      <w:r>
+        <w:rPr>
+          <w:rFonts w:ascii="Calibri" w:hAnsi="Calibri" w:eastAsia="微软雅黑"/>
+          <w:b/>
+          <w:color w:val="23201C"/>
+          <w:sz w:val="22"/>
+        </w:rPr>
+        <w:t>存储空间不足</w:t>
+      </w:r>
+      <w:r>
+        <w:rPr>
+          <w:rFonts w:ascii="Calibri" w:hAnsi="Calibri" w:eastAsia="微软雅黑"/>
+          <w:b w:val="0"/>
+          <w:color w:val="23201C"/>
+          <w:sz w:val="22"/>
+        </w:rPr>
+        <w:t>：设置里看剩余空间，不到 200MB 先清缓存再装。</w:t>
+      </w:r>
+    </w:p>
+    <w:p>
+      <w:pPr>
+        <w:spacing w:before="0" w:after="120"/>
+      </w:pPr>
+      <w:r>
+        <w:rPr>
+          <w:rFonts w:ascii="Calibri" w:hAnsi="Calibri" w:eastAsia="微软雅黑"/>
+          <w:b w:val="0"/>
+          <w:color w:val="23201C"/>
+          <w:sz w:val="22"/>
+        </w:rPr>
+        <w:t>6. 都不行就用电脑装，绕开电视的安装器：见第五节。还装不上，记下</w:t>
+      </w:r>
+      <w:r>
+        <w:rPr>
+          <w:rFonts w:ascii="Calibri" w:hAnsi="Calibri" w:eastAsia="微软雅黑"/>
+          <w:b/>
+          <w:color w:val="23201C"/>
+          <w:sz w:val="22"/>
+        </w:rPr>
+        <w:t>电视型号 + 安卓版本 + 提示原文</w:t>
+      </w:r>
+      <w:r>
+        <w:rPr>
+          <w:rFonts w:ascii="Calibri" w:hAnsi="Calibri" w:eastAsia="微软雅黑"/>
+          <w:b w:val="0"/>
+          <w:color w:val="23201C"/>
+          <w:sz w:val="22"/>
+        </w:rPr>
+        <w:t>发群里。型号在 设置 → 关于 里看。</w:t>
       </w:r>
     </w:p>
     <w:p>
@@ -274,7 +690,7 @@
     </w:p>
     <w:p>
       <w:pPr>
-        <w:spacing w:before="120" w:after="40"/>
+        <w:spacing w:before="160" w:after="40"/>
       </w:pPr>
       <w:r>
         <w:rPr>
@@ -302,7 +718,7 @@
     </w:p>
     <w:p>
       <w:pPr>
-        <w:spacing w:before="120" w:after="40"/>
+        <w:spacing w:before="160" w:after="40"/>
       </w:pPr>
       <w:r>
         <w:rPr>
@@ -325,7 +741,21 @@
           <w:color w:val="23201C"/>
           <w:sz w:val="22"/>
         </w:rPr>
-        <w:t>设置 → 使用情况访问 → 找到「电视桌面」→ 允许。有的固件在：设置 → 应用 → 特殊权限 → 使用情况访问。</w:t>
+        <w:t>设置 → 使用情况访问 → 找到「电视桌面」→ 允许。</w:t>
+      </w:r>
+    </w:p>
+    <w:p>
+      <w:pPr>
+        <w:spacing w:before="0" w:after="120"/>
+      </w:pPr>
+      <w:r>
+        <w:rPr>
+          <w:rFonts w:ascii="Calibri" w:hAnsi="Calibri" w:eastAsia="微软雅黑"/>
+          <w:b w:val="0"/>
+          <w:color w:val="23201C"/>
+          <w:sz w:val="22"/>
+        </w:rPr>
+        <w:t>有的固件在：设置 → 应用 → 特殊权限 → 使用情况访问。</w:t>
       </w:r>
     </w:p>
     <w:p>
@@ -368,7 +798,7 @@
           <w:color w:val="23201C"/>
           <w:sz w:val="22"/>
         </w:rPr>
-        <w:t>打开「电视桌面」。之后按 Home 就回这个桌面；已经在桌面时按 Home，回到第一屏。</w:t>
+        <w:t>装完在电视的「应用」列表里会多一个「电视桌面」图标，点它打开。之后按 Home 就回这个桌面；已经在桌面时按 Home，回到第一屏。</w:t>
       </w:r>
     </w:p>
     <w:p>
@@ -398,7 +828,7 @@
           <w:color w:val="23201C"/>
           <w:sz w:val="22"/>
         </w:rPr>
-        <w:t>选项/菜单键打开控制中心：网络、蓝牙、音量、亮度。</w:t>
+        <w:t>右上角两个入口：左边 Wi-Fi，右边控制中心（开关图标）。部分遥控器的菜单/设置键直接开「桌面设置」。</w:t>
       </w:r>
     </w:p>
     <w:p>
@@ -413,52 +843,7 @@
           <w:color w:val="23201C"/>
           <w:sz w:val="22"/>
         </w:rPr>
-        <w:t>右上角三个按钮：桌面（壁纸和外观）、常用（挑常用应用）、控制中心。</w:t>
-      </w:r>
-    </w:p>
-    <w:p>
-      <w:pPr>
-        <w:pStyle w:val="ListBullet"/>
-        <w:spacing w:after="80"/>
-      </w:pPr>
-      <w:r>
-        <w:rPr>
-          <w:rFonts w:ascii="Calibri" w:hAnsi="Calibri" w:eastAsia="微软雅黑"/>
-          <w:b w:val="0"/>
-          <w:color w:val="23201C"/>
-          <w:sz w:val="22"/>
-        </w:rPr>
-        <w:t>每行图标数在「桌面」面板里改：自动 / 4 / 6 / 8，点一下图标小一档，只动下面的应用区，顶上时间和右上角按钮不变。</w:t>
-      </w:r>
-    </w:p>
-    <w:p>
-      <w:pPr>
-        <w:pStyle w:val="ListBullet"/>
-        <w:spacing w:after="80"/>
-      </w:pPr>
-      <w:r>
-        <w:rPr>
-          <w:rFonts w:ascii="Calibri" w:hAnsi="Calibri" w:eastAsia="微软雅黑"/>
-          <w:b w:val="0"/>
-          <w:color w:val="23201C"/>
-          <w:sz w:val="22"/>
-        </w:rPr>
-        <w:t>长按应用图标：加入常用、移出常用、卸载应用。</w:t>
-      </w:r>
-    </w:p>
-    <w:p>
-      <w:pPr>
-        <w:pStyle w:val="ListBullet"/>
-        <w:spacing w:after="80"/>
-      </w:pPr>
-      <w:r>
-        <w:rPr>
-          <w:rFonts w:ascii="Calibri" w:hAnsi="Calibri" w:eastAsia="微软雅黑"/>
-          <w:b w:val="0"/>
-          <w:color w:val="23201C"/>
-          <w:sz w:val="22"/>
-        </w:rPr>
-        <w:t>顶栏显示当地天气，IP 自动定位，30 分钟刷新一次。天气动态壁纸在「桌面」面板里开。</w:t>
+        <w:t>控制中心里：输入源、壁纸、常用应用、电视设置四个圆钮；下面有蓝牙、Dock 图标数量、运行中应用与服务、一键清理、按键映射；再下面是音量、投屏、检查更新、发送反馈。</w:t>
       </w:r>
     </w:p>
     <w:p>
@@ -474,6 +859,96 @@
           <w:sz w:val="22"/>
         </w:rPr>
         <w:t>控制中心 → 输入源：可以直接切 HDMI1/2/3、TV、AV（接游戏机、机顶盒用）。</w:t>
+      </w:r>
+    </w:p>
+    <w:p>
+      <w:pPr>
+        <w:pStyle w:val="ListBullet"/>
+        <w:spacing w:after="80"/>
+      </w:pPr>
+      <w:r>
+        <w:rPr>
+          <w:rFonts w:ascii="Calibri" w:hAnsi="Calibri" w:eastAsia="微软雅黑"/>
+          <w:b w:val="0"/>
+          <w:color w:val="23201C"/>
+          <w:sz w:val="22"/>
+        </w:rPr>
+        <w:t>每行图标数在「桌面设置」里改：自动 / 4 / 6 / 8，点一下图标小一档，只动下面的应用区，顶上时间和右上角按钮不变。</w:t>
+      </w:r>
+    </w:p>
+    <w:p>
+      <w:pPr>
+        <w:pStyle w:val="ListBullet"/>
+        <w:spacing w:after="80"/>
+      </w:pPr>
+      <w:r>
+        <w:rPr>
+          <w:rFonts w:ascii="Calibri" w:hAnsi="Calibri" w:eastAsia="微软雅黑"/>
+          <w:b w:val="0"/>
+          <w:color w:val="23201C"/>
+          <w:sz w:val="22"/>
+        </w:rPr>
+        <w:t>Dock 图标数量在控制中心里改（1–8），调小后多出来的应用自动回桌面。</w:t>
+      </w:r>
+    </w:p>
+    <w:p>
+      <w:pPr>
+        <w:pStyle w:val="ListBullet"/>
+        <w:spacing w:after="80"/>
+      </w:pPr>
+      <w:r>
+        <w:rPr>
+          <w:rFonts w:ascii="Calibri" w:hAnsi="Calibri" w:eastAsia="微软雅黑"/>
+          <w:b w:val="0"/>
+          <w:color w:val="23201C"/>
+          <w:sz w:val="22"/>
+        </w:rPr>
+        <w:t>长按桌面应用图标：新建文件夹、移入文件夹、加入常用、卸载。</w:t>
+      </w:r>
+    </w:p>
+    <w:p>
+      <w:pPr>
+        <w:pStyle w:val="ListBullet"/>
+        <w:spacing w:after="80"/>
+      </w:pPr>
+      <w:r>
+        <w:rPr>
+          <w:rFonts w:ascii="Calibri" w:hAnsi="Calibri" w:eastAsia="微软雅黑"/>
+          <w:b w:val="0"/>
+          <w:color w:val="23201C"/>
+          <w:sz w:val="22"/>
+        </w:rPr>
+        <w:t>长按 Dock 图标：加入常用、调整顺序、卸载。</w:t>
+      </w:r>
+    </w:p>
+    <w:p>
+      <w:pPr>
+        <w:pStyle w:val="ListBullet"/>
+        <w:spacing w:after="80"/>
+      </w:pPr>
+      <w:r>
+        <w:rPr>
+          <w:rFonts w:ascii="Calibri" w:hAnsi="Calibri" w:eastAsia="微软雅黑"/>
+          <w:b w:val="0"/>
+          <w:color w:val="23201C"/>
+          <w:sz w:val="22"/>
+        </w:rPr>
+        <w:t>文件夹点开是玻璃面板，里面是图标 + 名字；长按文件夹可以添加应用或解散。</w:t>
+      </w:r>
+    </w:p>
+    <w:p>
+      <w:pPr>
+        <w:pStyle w:val="ListBullet"/>
+        <w:spacing w:after="80"/>
+      </w:pPr>
+      <w:r>
+        <w:rPr>
+          <w:rFonts w:ascii="Calibri" w:hAnsi="Calibri" w:eastAsia="微软雅黑"/>
+          <w:b w:val="0"/>
+          <w:color w:val="23201C"/>
+          <w:sz w:val="22"/>
+        </w:rPr>
+        <w:t>顶栏显示当地天气，IP 自动定位，30 分钟刷新一次。天气动态壁纸在「桌面设置」里开。</w:t>
       </w:r>
     </w:p>
     <w:p>
@@ -517,13 +992,12 @@
           <w:color w:val="23201C"/>
           <w:sz w:val="30"/>
         </w:rPr>
-        <w:t>五、用电脑开权限（设置里找不到时）</w:t>
+        <w:t>五、用电脑安装和开权限（U 盘装不上时）</w:t>
       </w:r>
     </w:p>
     <w:p>
       <w:pPr>
-        <w:pStyle w:val="ListBullet"/>
-        <w:spacing w:after="80"/>
+        <w:spacing w:before="0" w:after="120"/>
       </w:pPr>
       <w:r>
         <w:rPr>
@@ -532,13 +1006,12 @@
           <w:color w:val="23201C"/>
           <w:sz w:val="22"/>
         </w:rPr>
-        <w:t>电视：设置 → 账号与安全 → ADB 调试，打开。记下电视 IP（设置 → 关于 → 网络信息）。</w:t>
+        <w:t>电视提示「应用未安装 / 已阻止」、U 盘又找不到地方装时，用电脑的 adb 直接装，电视自己的安装器拦不到。</w:t>
       </w:r>
     </w:p>
     <w:p>
       <w:pPr>
-        <w:pStyle w:val="ListBullet"/>
-        <w:spacing w:after="80"/>
+        <w:spacing w:before="0" w:after="120"/>
       </w:pPr>
       <w:r>
         <w:rPr>
@@ -547,7 +1020,102 @@
           <w:color w:val="23201C"/>
           <w:sz w:val="22"/>
         </w:rPr>
-        <w:t>电脑装好 adb（platform-tools），执行：</w:t>
+        <w:t>1. 电视：设置 → 账号与安全 → ADB 调试，打开。记下电视 IP（设置 → 关于 → 网络信息）。</w:t>
+      </w:r>
+    </w:p>
+    <w:p>
+      <w:pPr>
+        <w:spacing w:before="0" w:after="120"/>
+      </w:pPr>
+      <w:r>
+        <w:rPr>
+          <w:rFonts w:ascii="Calibri" w:hAnsi="Calibri" w:eastAsia="微软雅黑"/>
+          <w:b w:val="0"/>
+          <w:color w:val="23201C"/>
+          <w:sz w:val="22"/>
+        </w:rPr>
+        <w:t>2. 电脑装好 adb（platform-tools）。</w:t>
+      </w:r>
+    </w:p>
+    <w:p>
+      <w:pPr>
+        <w:spacing w:before="0" w:after="120"/>
+      </w:pPr>
+      <w:r>
+        <w:rPr>
+          <w:rFonts w:ascii="Calibri" w:hAnsi="Calibri" w:eastAsia="微软雅黑"/>
+          <w:b w:val="0"/>
+          <w:color w:val="23201C"/>
+          <w:sz w:val="22"/>
+        </w:rPr>
+        <w:t>3. 安装（Mac / Linux，在解压出来的目录里执行）：</w:t>
+      </w:r>
+    </w:p>
+    <w:p>
+      <w:pPr>
+        <w:spacing w:before="0" w:after="0"/>
+        <w:ind w:left="340"/>
+        <w:shd w:val="clear" w:fill="F2F2F2"/>
+      </w:pPr>
+      <w:r>
+        <w:rPr>
+          <w:rFonts w:ascii="Consolas" w:hAnsi="Consolas" w:eastAsia="Consolas"/>
+          <w:b w:val="0"/>
+          <w:color w:val="23201C"/>
+          <w:sz w:val="20"/>
+        </w:rPr>
+        <w:t>bash install-tvhome.sh 192.168.1.23</w:t>
+      </w:r>
+    </w:p>
+    <w:p>
+      <w:pPr>
+        <w:spacing w:before="0" w:after="80"/>
+      </w:pPr>
+    </w:p>
+    <w:p>
+      <w:pPr>
+        <w:spacing w:before="0" w:after="120"/>
+      </w:pPr>
+      <w:r>
+        <w:rPr>
+          <w:rFonts w:ascii="Calibri" w:hAnsi="Calibri" w:eastAsia="微软雅黑"/>
+          <w:b w:val="0"/>
+          <w:color w:val="23201C"/>
+          <w:sz w:val="22"/>
+        </w:rPr>
+        <w:t xml:space="preserve">Windows 双击 </w:t>
+      </w:r>
+      <w:r>
+        <w:rPr>
+          <w:rFonts w:ascii="Consolas" w:hAnsi="Consolas" w:eastAsia="Consolas"/>
+          <w:b w:val="0"/>
+          <w:color w:val="23201C"/>
+          <w:sz w:val="22"/>
+        </w:rPr>
+        <w:t>install-tvhome.bat</w:t>
+      </w:r>
+      <w:r>
+        <w:rPr>
+          <w:rFonts w:ascii="Calibri" w:hAnsi="Calibri" w:eastAsia="微软雅黑"/>
+          <w:b w:val="0"/>
+          <w:color w:val="23201C"/>
+          <w:sz w:val="22"/>
+        </w:rPr>
+        <w:t>，按提示输入电视 IP。脚本会自己找同目录里的 apk，装不上时会直接说原因（签名冲突、版本更高、系统太老、空间不足）。</w:t>
+      </w:r>
+    </w:p>
+    <w:p>
+      <w:pPr>
+        <w:spacing w:before="0" w:after="120"/>
+      </w:pPr>
+      <w:r>
+        <w:rPr>
+          <w:rFonts w:ascii="Calibri" w:hAnsi="Calibri" w:eastAsia="微软雅黑"/>
+          <w:b w:val="0"/>
+          <w:color w:val="23201C"/>
+          <w:sz w:val="22"/>
+        </w:rPr>
+        <w:t>4. 装完开权限，执行：</w:t>
       </w:r>
     </w:p>
     <w:p>
@@ -635,7 +1203,7 @@
     </w:p>
     <w:p>
       <w:pPr>
-        <w:spacing w:before="0" w:after="40"/>
+        <w:spacing w:before="160" w:after="40"/>
       </w:pPr>
       <w:r>
         <w:rPr>
@@ -658,7 +1226,21 @@
           <w:color w:val="23201C"/>
           <w:sz w:val="22"/>
         </w:rPr>
-        <w:t>桌面顶部最右边「桌面」→ 面板最下面「卸载桌面（恢复原厂）」→ 系统弹卸载确认 → 确定。卸载后原厂桌面自动回来。</w:t>
+        <w:t>按遥控器菜单/设置键打开「桌面设置」→ 面板最下面「卸载桌面（恢复原厂）」→ 系统弹卸载确认 → 确定。</w:t>
+      </w:r>
+    </w:p>
+    <w:p>
+      <w:pPr>
+        <w:spacing w:before="0" w:after="120"/>
+      </w:pPr>
+      <w:r>
+        <w:rPr>
+          <w:rFonts w:ascii="Calibri" w:hAnsi="Calibri" w:eastAsia="微软雅黑"/>
+          <w:b w:val="0"/>
+          <w:color w:val="23201C"/>
+          <w:sz w:val="22"/>
+        </w:rPr>
+        <w:t>卸载后原厂桌面自动回来。</w:t>
       </w:r>
     </w:p>
     <w:p>
@@ -677,8 +1259,7 @@
     </w:p>
     <w:p>
       <w:pPr>
-        <w:pStyle w:val="ListBullet"/>
-        <w:spacing w:after="80"/>
+        <w:spacing w:before="0" w:after="120"/>
       </w:pPr>
       <w:r>
         <w:rPr>
@@ -687,13 +1268,12 @@
           <w:color w:val="23201C"/>
           <w:sz w:val="22"/>
         </w:rPr>
-        <w:t>设置 → 无障碍 → 关掉「Home 键回顶」</w:t>
+        <w:t>1. 设置 → 无障碍 → 关掉「Home 键回顶」</w:t>
       </w:r>
     </w:p>
     <w:p>
       <w:pPr>
-        <w:pStyle w:val="ListBullet"/>
-        <w:spacing w:after="80"/>
+        <w:spacing w:before="0" w:after="120"/>
       </w:pPr>
       <w:r>
         <w:rPr>
@@ -702,13 +1282,12 @@
           <w:color w:val="23201C"/>
           <w:sz w:val="22"/>
         </w:rPr>
-        <w:t>设置 → 使用情况访问 → 关掉「电视桌面」</w:t>
+        <w:t>2. 设置 → 使用情况访问 → 关掉「电视桌面」</w:t>
       </w:r>
     </w:p>
     <w:p>
       <w:pPr>
-        <w:pStyle w:val="ListBullet"/>
-        <w:spacing w:after="80"/>
+        <w:spacing w:before="0" w:after="120"/>
       </w:pPr>
       <w:r>
         <w:rPr>
@@ -717,7 +1296,7 @@
           <w:color w:val="23201C"/>
           <w:sz w:val="22"/>
         </w:rPr>
-        <w:t>设置 → 应用 → 应用管理 → 电视桌面 → 卸载</w:t>
+        <w:t>3. 设置 → 应用 → 应用管理 → 电视桌面 → 卸载</w:t>
       </w:r>
     </w:p>
     <w:p>
@@ -760,7 +1339,25 @@
           <w:color w:val="23201C"/>
           <w:sz w:val="22"/>
         </w:rPr>
-        <w:t>Windows：双击 restore-tvhome.bat，输入电视 IP。</w:t>
+        <w:t xml:space="preserve">Windows：双击 </w:t>
+      </w:r>
+      <w:r>
+        <w:rPr>
+          <w:rFonts w:ascii="Consolas" w:hAnsi="Consolas" w:eastAsia="Consolas"/>
+          <w:b w:val="0"/>
+          <w:color w:val="23201C"/>
+          <w:sz w:val="22"/>
+        </w:rPr>
+        <w:t>restore-tvhome.bat</w:t>
+      </w:r>
+      <w:r>
+        <w:rPr>
+          <w:rFonts w:ascii="Calibri" w:hAnsi="Calibri" w:eastAsia="微软雅黑"/>
+          <w:b w:val="0"/>
+          <w:color w:val="23201C"/>
+          <w:sz w:val="22"/>
+        </w:rPr>
+        <w:t>，输入电视 IP。</w:t>
       </w:r>
     </w:p>
     <w:p>
@@ -775,7 +1372,25 @@
           <w:color w:val="23201C"/>
           <w:sz w:val="22"/>
         </w:rPr>
-        <w:t>Mac：终端执行 bash restore-tvhome.sh 192.168.1.23。</w:t>
+        <w:t xml:space="preserve">Mac：终端执行 </w:t>
+      </w:r>
+      <w:r>
+        <w:rPr>
+          <w:rFonts w:ascii="Consolas" w:hAnsi="Consolas" w:eastAsia="Consolas"/>
+          <w:b w:val="0"/>
+          <w:color w:val="23201C"/>
+          <w:sz w:val="22"/>
+        </w:rPr>
+        <w:t>bash restore-tvhome.sh 192.168.1.23</w:t>
+      </w:r>
+      <w:r>
+        <w:rPr>
+          <w:rFonts w:ascii="Calibri" w:hAnsi="Calibri" w:eastAsia="微软雅黑"/>
+          <w:b w:val="0"/>
+          <w:color w:val="23201C"/>
+          <w:sz w:val="22"/>
+        </w:rPr>
+        <w:t>。</w:t>
       </w:r>
     </w:p>
     <w:p>
@@ -817,7 +1432,25 @@
           <w:color w:val="23201C"/>
           <w:sz w:val="22"/>
         </w:rPr>
-        <w:t>安卓 6.0 以下的电视装 tvhome-zh-2.0.15-legacy.apk，界面和用法一样，区别在下面几点。</w:t>
+        <w:t xml:space="preserve">安卓 6.0 以下的电视装 </w:t>
+      </w:r>
+      <w:r>
+        <w:rPr>
+          <w:rFonts w:ascii="Consolas" w:hAnsi="Consolas" w:eastAsia="Consolas"/>
+          <w:b w:val="0"/>
+          <w:color w:val="23201C"/>
+          <w:sz w:val="22"/>
+        </w:rPr>
+        <w:t>tvhome-zh-2.1.7-legacy.apk</w:t>
+      </w:r>
+      <w:r>
+        <w:rPr>
+          <w:rFonts w:ascii="Calibri" w:hAnsi="Calibri" w:eastAsia="微软雅黑"/>
+          <w:b w:val="0"/>
+          <w:color w:val="23201C"/>
+          <w:sz w:val="22"/>
+        </w:rPr>
+        <w:t>，界面和用法一样，区别在下面几点。</w:t>
       </w:r>
     </w:p>
     <w:p>
@@ -828,11 +1461,20 @@
       <w:r>
         <w:rPr>
           <w:rFonts w:ascii="Calibri" w:hAnsi="Calibri" w:eastAsia="微软雅黑"/>
+          <w:b/>
+          <w:color w:val="23201C"/>
+          <w:sz w:val="22"/>
+        </w:rPr>
+        <w:t>装哪个</w:t>
+      </w:r>
+      <w:r>
+        <w:rPr>
+          <w:rFonts w:ascii="Calibri" w:hAnsi="Calibri" w:eastAsia="微软雅黑"/>
           <w:b w:val="0"/>
           <w:color w:val="23201C"/>
           <w:sz w:val="22"/>
         </w:rPr>
-        <w:t>装哪个：安卓 6.0 及以上装普通版，4.0–5.1 装老设备版。装错了系统会拒绝安装，不会把电视弄坏。</w:t>
+        <w:t>：安卓 6.0 及以上装普通版，4.0–5.1 装老设备版。装错了系统会拒绝安装，不会把电视弄坏。</w:t>
       </w:r>
     </w:p>
     <w:p>
@@ -843,11 +1485,20 @@
       <w:r>
         <w:rPr>
           <w:rFonts w:ascii="Calibri" w:hAnsi="Calibri" w:eastAsia="微软雅黑"/>
+          <w:b/>
+          <w:color w:val="23201C"/>
+          <w:sz w:val="22"/>
+        </w:rPr>
+        <w:t>权限只开无障碍</w:t>
+      </w:r>
+      <w:r>
+        <w:rPr>
+          <w:rFonts w:ascii="Calibri" w:hAnsi="Calibri" w:eastAsia="微软雅黑"/>
           <w:b w:val="0"/>
           <w:color w:val="23201C"/>
           <w:sz w:val="22"/>
         </w:rPr>
-        <w:t>权限只开无障碍：安卓 4.4 及以下没有「使用情况访问」，只开无障碍就够；5.x 两个都开，和其它机型一样。</w:t>
+        <w:t>：安卓 4.4 及以下没有「使用情况访问」，只开无障碍就够；5.x 两个都开，和其它机型一样。</w:t>
       </w:r>
     </w:p>
     <w:p>
@@ -858,11 +1509,20 @@
       <w:r>
         <w:rPr>
           <w:rFonts w:ascii="Calibri" w:hAnsi="Calibri" w:eastAsia="微软雅黑"/>
+          <w:b/>
+          <w:color w:val="23201C"/>
+          <w:sz w:val="22"/>
+        </w:rPr>
+        <w:t>海报和片段可能没有</w:t>
+      </w:r>
+      <w:r>
+        <w:rPr>
+          <w:rFonts w:ascii="Calibri" w:hAnsi="Calibri" w:eastAsia="微软雅黑"/>
           <w:b w:val="0"/>
           <w:color w:val="23201C"/>
           <w:sz w:val="22"/>
         </w:rPr>
-        <w:t>海报和片段可能没有：老电视的网络加密协议旧，取不到图时会显示静态壁纸，桌面照常用。</w:t>
+        <w:t>：老电视的网络加密协议旧，取不到图时会显示静态壁纸，桌面照常用。</w:t>
       </w:r>
     </w:p>
     <w:p>
@@ -873,11 +1533,20 @@
       <w:r>
         <w:rPr>
           <w:rFonts w:ascii="Calibri" w:hAnsi="Calibri" w:eastAsia="微软雅黑"/>
+          <w:b/>
+          <w:color w:val="23201C"/>
+          <w:sz w:val="22"/>
+        </w:rPr>
+        <w:t>更新走老设备线路</w:t>
+      </w:r>
+      <w:r>
+        <w:rPr>
+          <w:rFonts w:ascii="Calibri" w:hAnsi="Calibri" w:eastAsia="微软雅黑"/>
           <w:b w:val="0"/>
           <w:color w:val="23201C"/>
           <w:sz w:val="22"/>
         </w:rPr>
-        <w:t>更新走老设备线路：装好后自动检查老设备版的更新，不会覆盖成普通版。</w:t>
+        <w:t>：装好后自动检查老设备版的更新，不会覆盖成普通版。</w:t>
       </w:r>
     </w:p>
     <w:p>
@@ -888,11 +1557,20 @@
       <w:r>
         <w:rPr>
           <w:rFonts w:ascii="Calibri" w:hAnsi="Calibri" w:eastAsia="微软雅黑"/>
+          <w:b/>
+          <w:color w:val="23201C"/>
+          <w:sz w:val="22"/>
+        </w:rPr>
+        <w:t>反馈一样能发</w:t>
+      </w:r>
+      <w:r>
+        <w:rPr>
+          <w:rFonts w:ascii="Calibri" w:hAnsi="Calibri" w:eastAsia="微软雅黑"/>
           <w:b w:val="0"/>
           <w:color w:val="23201C"/>
           <w:sz w:val="22"/>
         </w:rPr>
-        <w:t>反馈一样能发：控制中心里的「发送反馈」可用，群里报问题时说一声是老电视、什么型号。</w:t>
+        <w:t>：控制中心里的「发送反馈」可用，群里报问题时说一声是老电视、什么型号。</w:t>
       </w:r>
     </w:p>
     <w:p>
@@ -903,11 +1581,20 @@
       <w:r>
         <w:rPr>
           <w:rFonts w:ascii="Calibri" w:hAnsi="Calibri" w:eastAsia="微软雅黑"/>
+          <w:b/>
+          <w:color w:val="23201C"/>
+          <w:sz w:val="22"/>
+        </w:rPr>
+        <w:t>恢复原厂</w:t>
+      </w:r>
+      <w:r>
+        <w:rPr>
+          <w:rFonts w:ascii="Calibri" w:hAnsi="Calibri" w:eastAsia="微软雅黑"/>
           <w:b w:val="0"/>
           <w:color w:val="23201C"/>
           <w:sz w:val="22"/>
         </w:rPr>
-        <w:t>恢复原厂：和第六节完全相同，卸载后原厂桌面自动回来。</w:t>
+        <w:t>：和第六节完全相同，卸载后原厂桌面自动回来。</w:t>
       </w:r>
     </w:p>
     <w:p>
@@ -932,11 +1619,20 @@
       <w:r>
         <w:rPr>
           <w:rFonts w:ascii="Calibri" w:hAnsi="Calibri" w:eastAsia="微软雅黑"/>
+          <w:b/>
+          <w:color w:val="23201C"/>
+          <w:sz w:val="22"/>
+        </w:rPr>
+        <w:t>开机先进了原厂桌面</w:t>
+      </w:r>
+      <w:r>
+        <w:rPr>
+          <w:rFonts w:ascii="Calibri" w:hAnsi="Calibri" w:eastAsia="微软雅黑"/>
           <w:b w:val="0"/>
           <w:color w:val="23201C"/>
           <w:sz w:val="22"/>
         </w:rPr>
-        <w:t>开机先进了原厂桌面：正常，几秒内自动盖回来。</w:t>
+        <w:t>：正常，几秒内自动盖回来。</w:t>
       </w:r>
     </w:p>
     <w:p>
@@ -947,11 +1643,20 @@
       <w:r>
         <w:rPr>
           <w:rFonts w:ascii="Calibri" w:hAnsi="Calibri" w:eastAsia="微软雅黑"/>
+          <w:b/>
+          <w:color w:val="23201C"/>
+          <w:sz w:val="22"/>
+        </w:rPr>
+        <w:t>装完找不到「电视桌面」</w:t>
+      </w:r>
+      <w:r>
+        <w:rPr>
+          <w:rFonts w:ascii="Calibri" w:hAnsi="Calibri" w:eastAsia="微软雅黑"/>
           <w:b w:val="0"/>
           <w:color w:val="23201C"/>
           <w:sz w:val="22"/>
         </w:rPr>
-        <w:t>按 Home 还是回原厂：检查两个权限是不是都开了；重装过的话无障碍会掉，重新打开一次。</w:t>
+        <w:t>：在电视的「应用」列表里，图标是一个桌面图案，名字叫「电视桌面」；有的固件要按「下」翻到第二行。实在找不到就重装一次，安装完成时直接点「打开」。</w:t>
       </w:r>
     </w:p>
     <w:p>
@@ -962,11 +1667,20 @@
       <w:r>
         <w:rPr>
           <w:rFonts w:ascii="Calibri" w:hAnsi="Calibri" w:eastAsia="微软雅黑"/>
+          <w:b/>
+          <w:color w:val="23201C"/>
+          <w:sz w:val="22"/>
+        </w:rPr>
+        <w:t>装的时候提示「应用未安装」/「已阻止」</w:t>
+      </w:r>
+      <w:r>
+        <w:rPr>
+          <w:rFonts w:ascii="Calibri" w:hAnsi="Calibri" w:eastAsia="微软雅黑"/>
           <w:b w:val="0"/>
           <w:color w:val="23201C"/>
           <w:sz w:val="22"/>
         </w:rPr>
-        <w:t>点「下载并安装」提示「此电视不支持」：1.7.1 及以前的小米电视会这样。用这个包手动装一次 2.0.15，之后再升级就正常了。</w:t>
+        <w:t>：见第二节下面的排查顺序，九成是旧版签名冲突或没开未知来源。</w:t>
       </w:r>
     </w:p>
     <w:p>
@@ -977,11 +1691,20 @@
       <w:r>
         <w:rPr>
           <w:rFonts w:ascii="Calibri" w:hAnsi="Calibri" w:eastAsia="微软雅黑"/>
+          <w:b/>
+          <w:color w:val="23201C"/>
+          <w:sz w:val="22"/>
+        </w:rPr>
+        <w:t>按 Home 还是回原厂</w:t>
+      </w:r>
+      <w:r>
+        <w:rPr>
+          <w:rFonts w:ascii="Calibri" w:hAnsi="Calibri" w:eastAsia="微软雅黑"/>
           <w:b w:val="0"/>
           <w:color w:val="23201C"/>
           <w:sz w:val="22"/>
         </w:rPr>
-        <w:t>海报没有图：先确认电视联网；第一次打开要拉一遍数据，稍等一会儿。</w:t>
+        <w:t>：检查两个权限是不是都开了；重装过的话无障碍会掉，重新打开一次。</w:t>
       </w:r>
     </w:p>
     <w:p>
@@ -992,11 +1715,20 @@
       <w:r>
         <w:rPr>
           <w:rFonts w:ascii="Calibri" w:hAnsi="Calibri" w:eastAsia="微软雅黑"/>
+          <w:b/>
+          <w:color w:val="23201C"/>
+          <w:sz w:val="22"/>
+        </w:rPr>
+        <w:t>点「下载并安装」提示「此电视不支持」</w:t>
+      </w:r>
+      <w:r>
+        <w:rPr>
+          <w:rFonts w:ascii="Calibri" w:hAnsi="Calibri" w:eastAsia="微软雅黑"/>
           <w:b w:val="0"/>
           <w:color w:val="23201C"/>
           <w:sz w:val="22"/>
         </w:rPr>
-        <w:t>遥控器失灵：长按电视电源键重启。还不行就跑一键恢复。</w:t>
+        <w:t>：1.7.1 及以前的小米电视会这样。用这个包手动装一次 2.1.7，之后再升级就正常了。</w:t>
       </w:r>
     </w:p>
     <w:p>
@@ -1007,11 +1739,68 @@
       <w:r>
         <w:rPr>
           <w:rFonts w:ascii="Calibri" w:hAnsi="Calibri" w:eastAsia="微软雅黑"/>
+          <w:b/>
+          <w:color w:val="23201C"/>
+          <w:sz w:val="22"/>
+        </w:rPr>
+        <w:t>海报没有图</w:t>
+      </w:r>
+      <w:r>
+        <w:rPr>
+          <w:rFonts w:ascii="Calibri" w:hAnsi="Calibri" w:eastAsia="微软雅黑"/>
           <w:b w:val="0"/>
           <w:color w:val="23201C"/>
           <w:sz w:val="22"/>
         </w:rPr>
-        <w:t>恢复后想再装：U 盘再装一次就行。</w:t>
+        <w:t>：先确认电视联网；第一次打开要拉一遍数据，稍等一会儿。</w:t>
+      </w:r>
+    </w:p>
+    <w:p>
+      <w:pPr>
+        <w:pStyle w:val="ListBullet"/>
+        <w:spacing w:after="80"/>
+      </w:pPr>
+      <w:r>
+        <w:rPr>
+          <w:rFonts w:ascii="Calibri" w:hAnsi="Calibri" w:eastAsia="微软雅黑"/>
+          <w:b/>
+          <w:color w:val="23201C"/>
+          <w:sz w:val="22"/>
+        </w:rPr>
+        <w:t>遥控器失灵</w:t>
+      </w:r>
+      <w:r>
+        <w:rPr>
+          <w:rFonts w:ascii="Calibri" w:hAnsi="Calibri" w:eastAsia="微软雅黑"/>
+          <w:b w:val="0"/>
+          <w:color w:val="23201C"/>
+          <w:sz w:val="22"/>
+        </w:rPr>
+        <w:t>：长按电视电源键重启。还不行就跑一键恢复。</w:t>
+      </w:r>
+    </w:p>
+    <w:p>
+      <w:pPr>
+        <w:pStyle w:val="ListBullet"/>
+        <w:spacing w:after="80"/>
+      </w:pPr>
+      <w:r>
+        <w:rPr>
+          <w:rFonts w:ascii="Calibri" w:hAnsi="Calibri" w:eastAsia="微软雅黑"/>
+          <w:b/>
+          <w:color w:val="23201C"/>
+          <w:sz w:val="22"/>
+        </w:rPr>
+        <w:t>恢复后想再装</w:t>
+      </w:r>
+      <w:r>
+        <w:rPr>
+          <w:rFonts w:ascii="Calibri" w:hAnsi="Calibri" w:eastAsia="微软雅黑"/>
+          <w:b w:val="0"/>
+          <w:color w:val="23201C"/>
+          <w:sz w:val="22"/>
+        </w:rPr>
+        <w:t>：U 盘再装一次就行。</w:t>
       </w:r>
     </w:p>
     <w:p>
@@ -1030,7 +1819,7 @@
           <w:color w:val="888480"/>
           <w:sz w:val="18"/>
         </w:rPr>
-        <w:t>— 电视桌面 2.0.15 · 2026-10</w:t>
+        <w:t>— 电视桌面 2.1.7 · 2026-10</w:t>
       </w:r>
     </w:p>
     <w:sectPr>

</xml_diff>

<commit_message>
Fix input switching on Xiaomi TVs; ship 2.1.11 (69)
MIUI TVs have no TV input service, so the platform's channel view intent has
no handler and every source press ended on 「此电视不支持」. Fall back to the
vendor player's ExternalSourceActivity, which does switch ports.

Also in this release:
- Weather wallpaper plays again instead of going black; trailers stand down
  while it runs and no longer go black on Xiaomi.
- 常用应用 / 应用信息 / 桌面设置 no longer dead-end on unsupported pages;
  they fall back to the closest page that exists.
- Bing daily wallpaper uses HTTP on Android 4.x, where TLS fails.
</commit_message>
<xml_diff>
--- a/docs/安装与恢复教程.docx
+++ b/docs/安装与恢复教程.docx
@@ -13,7 +13,7 @@
           <w:color w:val="23201C"/>
           <w:sz w:val="40"/>
         </w:rPr>
-        <w:t>电视桌面 2.1.7 安装教程</w:t>
+        <w:t>电视桌面 2.1.11 安装教程</w:t>
       </w:r>
     </w:p>
     <w:p>
@@ -172,7 +172,7 @@
           <w:color w:val="23201C"/>
           <w:sz w:val="22"/>
         </w:rPr>
-        <w:t>tvhome-zh-2.1.7.apk</w:t>
+        <w:t>tvhome-zh-2.1.11.apk</w:t>
       </w:r>
       <w:r>
         <w:rPr>
@@ -190,7 +190,7 @@
           <w:color w:val="23201C"/>
           <w:sz w:val="22"/>
         </w:rPr>
-        <w:t>tvhome-zh-2.1.7-legacy.apk</w:t>
+        <w:t>tvhome-zh-2.1.11-legacy.apk</w:t>
       </w:r>
       <w:r>
         <w:rPr>
@@ -1441,7 +1441,7 @@
           <w:color w:val="23201C"/>
           <w:sz w:val="22"/>
         </w:rPr>
-        <w:t>tvhome-zh-2.1.7-legacy.apk</w:t>
+        <w:t>tvhome-zh-2.1.11-legacy.apk</w:t>
       </w:r>
       <w:r>
         <w:rPr>
@@ -1728,7 +1728,7 @@
           <w:color w:val="23201C"/>
           <w:sz w:val="22"/>
         </w:rPr>
-        <w:t>：1.7.1 及以前的小米电视会这样。用这个包手动装一次 2.1.7，之后再升级就正常了。</w:t>
+        <w:t>：1.7.1 及以前的小米电视会这样。用这个包手动装一次 2.1.11，之后再升级就正常了。</w:t>
       </w:r>
     </w:p>
     <w:p>
@@ -1819,7 +1819,7 @@
           <w:color w:val="888480"/>
           <w:sz w:val="18"/>
         </w:rPr>
-        <w:t>— 电视桌面 2.1.7 · 2026-10</w:t>
+        <w:t>— 电视桌面 2.1.11 · 2026-10</w:t>
       </w:r>
     </w:p>
     <w:sectPr>

</xml_diff>